<commit_message>
A regra das duas colunas vira bandeira: os 1305 não se movem
Ordem dele: regras e método podem mudar, mas os 1305 não. O casamento
volta a decidir só pela coluna do defeito (1.269 na saída, 1.305 na
tela); a segunda coluna — o ativo como elemento interrompido — vira a
bandeira int_na_janela, só de leitura, nos 10 casos em que ela pegaria.
O chip, a linha da tabela e o alerta do dossiê agora dizem isso com
todas as letras. metodo.json volta aos números de antes do #60 e todos
os derivados foram regerados; invariantes 20/20.

Co-Authored-By: Claude Fable 5 <noreply@anthropic.com>
Claude-Session: https://claude.ai/code/session_01RxofeRP7NcuPNAFpWh9sqt
</commit_message>
<xml_diff>
--- a/auditoria-transformadores-134/public/manuais/Manual_de_Regras_Auditoria_Transformadores_v2.docx
+++ b/auditoria-transformadores-134/public/manuais/Manual_de_Regras_Auditoria_Transformadores_v2.docx
@@ -107,15 +107,15 @@
           <w:sz w:val="21"/>
           <w:szCs w:val="21"/>
         </w:rPr>
-        <w:t xml:space="preserve">1.272 queimados e avariados</w:t>
-      </w:r>
-      <w:r>
-        <w:rPr>
-          <w:color w:val="222222"/>
-          <w:sz w:val="21"/>
-          <w:szCs w:val="21"/>
-        </w:rPr>
-        <w:t xml:space="preserve"> — 1.200 queimados e 72 avariados.</w:t>
+        <w:t xml:space="preserve">1.269 queimados e avariados</w:t>
+      </w:r>
+      <w:r>
+        <w:rPr>
+          <w:color w:val="222222"/>
+          <w:sz w:val="21"/>
+          <w:szCs w:val="21"/>
+        </w:rPr>
+        <w:t xml:space="preserve"> — 1.198 queimados e 71 avariados.</w:t>
       </w:r>
     </w:p>
     <w:p>
@@ -131,7 +131,7 @@
           <w:sz w:val="21"/>
           <w:szCs w:val="21"/>
         </w:rPr>
-        <w:t xml:space="preserve">Versão 2.0 · dados de 2026-08-05 · documento gerado em 05/08/2026 21:56</w:t>
+        <w:t xml:space="preserve">Versão 2.0 · dados de 2026-08-05 · documento gerado em 05/08/2026 22:08</w:t>
       </w:r>
     </w:p>
     <w:p>
@@ -271,7 +271,7 @@
           <w:sz w:val="21"/>
           <w:szCs w:val="21"/>
         </w:rPr>
-        <w:t xml:space="preserve">1.272</w:t>
+        <w:t xml:space="preserve">1.269</w:t>
       </w:r>
       <w:r>
         <w:rPr>
@@ -289,7 +289,7 @@
           <w:sz w:val="21"/>
           <w:szCs w:val="21"/>
         </w:rPr>
-        <w:t xml:space="preserve">213</w:t>
+        <w:t xml:space="preserve">220</w:t>
       </w:r>
       <w:r>
         <w:rPr>
@@ -307,7 +307,7 @@
           <w:sz w:val="21"/>
           <w:szCs w:val="21"/>
         </w:rPr>
-        <w:t xml:space="preserve">25</w:t>
+        <w:t xml:space="preserve">21</w:t>
       </w:r>
       <w:r>
         <w:rPr>
@@ -1557,7 +1557,7 @@
           <w:sz w:val="21"/>
           <w:szCs w:val="21"/>
         </w:rPr>
-        <w:t xml:space="preserve">213 solicitações</w:t>
+        <w:t xml:space="preserve">220 solicitações</w:t>
       </w:r>
       <w:r>
         <w:rPr>
@@ -1575,7 +1575,7 @@
           <w:sz w:val="21"/>
           <w:szCs w:val="21"/>
         </w:rPr>
-        <w:t xml:space="preserve">101</w:t>
+        <w:t xml:space="preserve">108</w:t>
       </w:r>
       <w:r>
         <w:rPr>
@@ -1737,7 +1737,7 @@
                 <w:sz w:val="19"/>
                 <w:szCs w:val="19"/>
               </w:rPr>
-              <w:t xml:space="preserve">71</w:t>
+              <w:t xml:space="preserve">77</w:t>
             </w:r>
           </w:p>
         </w:tc>
@@ -1791,7 +1791,7 @@
                 <w:sz w:val="19"/>
                 <w:szCs w:val="19"/>
               </w:rPr>
-              <w:t xml:space="preserve">30</w:t>
+              <w:t xml:space="preserve">31</w:t>
             </w:r>
           </w:p>
         </w:tc>
@@ -2961,7 +2961,7 @@
           <w:sz w:val="21"/>
           <w:szCs w:val="21"/>
         </w:rPr>
-        <w:t xml:space="preserve">71 ausentes</w:t>
+        <w:t xml:space="preserve">77 ausentes</w:t>
       </w:r>
       <w:r>
         <w:rPr>
@@ -2997,7 +2997,7 @@
           <w:sz w:val="21"/>
           <w:szCs w:val="21"/>
         </w:rPr>
-        <w:t xml:space="preserve">19</w:t>
+        <w:t xml:space="preserve">25</w:t>
       </w:r>
       <w:r>
         <w:rPr>
@@ -3029,7 +3029,7 @@
           <w:sz w:val="21"/>
           <w:szCs w:val="21"/>
         </w:rPr>
-        <w:t xml:space="preserve">30 fora da janela</w:t>
+        <w:t xml:space="preserve">31 fora da janela</w:t>
       </w:r>
       <w:r>
         <w:rPr>
@@ -3047,7 +3047,7 @@
           <w:sz w:val="21"/>
           <w:szCs w:val="21"/>
         </w:rPr>
-        <w:t xml:space="preserve">29</w:t>
+        <w:t xml:space="preserve">30</w:t>
       </w:r>
       <w:r>
         <w:rPr>
@@ -3290,7 +3290,7 @@
                 <w:sz w:val="19"/>
                 <w:szCs w:val="19"/>
               </w:rPr>
-              <w:t xml:space="preserve">10</w:t>
+              <w:t xml:space="preserve">11</w:t>
             </w:r>
           </w:p>
         </w:tc>
@@ -3443,7 +3443,7 @@
           <w:sz w:val="21"/>
           <w:szCs w:val="21"/>
         </w:rPr>
-        <w:t xml:space="preserve">21,1 dias</w:t>
+        <w:t xml:space="preserve">24,8 dias</w:t>
       </w:r>
       <w:r>
         <w:rPr>
@@ -3686,7 +3686,7 @@
           <w:sz w:val="21"/>
           <w:szCs w:val="21"/>
         </w:rPr>
-        <w:t xml:space="preserve">1.347 solicitações</w:t>
+        <w:t xml:space="preserve">1.337 solicitações</w:t>
       </w:r>
       <w:r>
         <w:rPr>
@@ -4192,7 +4192,7 @@
           <w:sz w:val="21"/>
           <w:szCs w:val="21"/>
         </w:rPr>
-        <w:t xml:space="preserve">138 solicitações</w:t>
+        <w:t xml:space="preserve">132 solicitações</w:t>
       </w:r>
       <w:r>
         <w:rPr>
@@ -4210,7 +4210,7 @@
           <w:sz w:val="21"/>
           <w:szCs w:val="21"/>
         </w:rPr>
-        <w:t xml:space="preserve">1.129</w:t>
+        <w:t xml:space="preserve">1.126</w:t>
       </w:r>
       <w:r>
         <w:rPr>
@@ -4228,7 +4228,7 @@
           <w:sz w:val="21"/>
           <w:szCs w:val="21"/>
         </w:rPr>
-        <w:t xml:space="preserve">30</w:t>
+        <w:t xml:space="preserve">32</w:t>
       </w:r>
       <w:r>
         <w:rPr>
@@ -4261,7 +4261,7 @@
           <w:sz w:val="21"/>
           <w:szCs w:val="21"/>
         </w:rPr>
-        <w:t xml:space="preserve">25 solicitações</w:t>
+        <w:t xml:space="preserve">21 solicitações</w:t>
       </w:r>
       <w:r>
         <w:rPr>
@@ -4279,7 +4279,7 @@
           <w:sz w:val="21"/>
           <w:szCs w:val="21"/>
         </w:rPr>
-        <w:t xml:space="preserve">21</w:t>
+        <w:t xml:space="preserve">19</w:t>
       </w:r>
       <w:r>
         <w:rPr>
@@ -4551,7 +4551,7 @@
                 <w:sz w:val="19"/>
                 <w:szCs w:val="19"/>
               </w:rPr>
-              <w:t xml:space="preserve">213</w:t>
+              <w:t xml:space="preserve">220</w:t>
             </w:r>
           </w:p>
         </w:tc>
@@ -4605,7 +4605,7 @@
                 <w:sz w:val="19"/>
                 <w:szCs w:val="19"/>
               </w:rPr>
-              <w:t xml:space="preserve">1.297</w:t>
+              <w:t xml:space="preserve">1.290</w:t>
             </w:r>
           </w:p>
         </w:tc>
@@ -4659,7 +4659,7 @@
                 <w:sz w:val="19"/>
                 <w:szCs w:val="19"/>
               </w:rPr>
-              <w:t xml:space="preserve">25</w:t>
+              <w:t xml:space="preserve">21</w:t>
             </w:r>
           </w:p>
         </w:tc>
@@ -4713,7 +4713,7 @@
                 <w:sz w:val="19"/>
                 <w:szCs w:val="19"/>
               </w:rPr>
-              <w:t xml:space="preserve">1.272</w:t>
+              <w:t xml:space="preserve">1.269</w:t>
             </w:r>
           </w:p>
         </w:tc>
@@ -4767,7 +4767,7 @@
                 <w:sz w:val="19"/>
                 <w:szCs w:val="19"/>
               </w:rPr>
-              <w:t xml:space="preserve">1.200</w:t>
+              <w:t xml:space="preserve">1.198</w:t>
             </w:r>
           </w:p>
         </w:tc>
@@ -4821,7 +4821,7 @@
                 <w:sz w:val="19"/>
                 <w:szCs w:val="19"/>
               </w:rPr>
-              <w:t xml:space="preserve">72</w:t>
+              <w:t xml:space="preserve">71</w:t>
             </w:r>
           </w:p>
         </w:tc>

</xml_diff>